<commit_message>
Soporte: correo kairigarcia.gestionprototal@gmail.com en footer global, aviso de cuenta, LEEME, README y manual de instalación
</commit_message>
<xml_diff>
--- a/docs/Word/INSTALACION-DESINSTALACION.docx
+++ b/docs/Word/INSTALACION-DESINSTALACION.docx
@@ -1179,6 +1179,36 @@
       <w:r>
         <w:t>.</w:t>
       </w:r>
+      <w:r/>
+    </w:p>
+    <w:p>
+      <w:pPr>
+        <w:pBdr>
+          <w:bottom w:val="single" w:sz="6" w:space="1" w:color="auto"/>
+        </w:pBdr>
+      </w:pPr>
+      <w:r/>
+    </w:p>
+    <w:p>
+      <w:pPr>
+        <w:pStyle w:val="Heading2"/>
+      </w:pPr>
+      <w:r>
+        <w:t>Soporte y contacto</w:t>
+      </w:r>
+      <w:r/>
+    </w:p>
+    <w:p>
+      <w:r/>
+      <w:r>
+        <w:t xml:space="preserve">Para cualquier duda o incidencia: </w:t>
+      </w:r>
+      <w:r>
+        <w:rPr>
+          <w:b/>
+        </w:rPr>
+        <w:t>kairigarcia.gestionprototal@gmail.com</w:t>
+      </w:r>
     </w:p>
     <w:sectPr>
       <w:pgSz w:w="12240" w:h="15840"/>

</xml_diff>